<commit_message>
Add Spotify-playlist artists (62) and New Orleans folk circle (19); rebuild xlsx, V_Map.md/pdf
Co-Authored-By: Claude Opus 5.5 <noreply@anthropic.com>
Claude-Session: https://claude.ai/code/session_01X7Jrr86evkTBn2uR5X2gyq
</commit_message>
<xml_diff>
--- a/work/deliverables/V_Map.docx
+++ b/work/deliverables/V_Map.docx
@@ -44,7 +44,7 @@
           <w:sz w:val="20"/>
           <w:szCs w:val="20"/>
         </w:rPr>
-        <w:t xml:space="preserve">Companion to V_Album_Atlas.xlsx · 2,861 albums · 54 lanes · September 2026</w:t>
+        <w:t xml:space="preserve">Companion to V_Album_Atlas.xlsx · 2,942 albums · 54 lanes · September 2026</w:t>
       </w:r>
     </w:p>
     <w:p>
@@ -644,7 +644,7 @@
                 <w:sz w:val="18"/>
                 <w:szCs w:val="18"/>
               </w:rPr>
-              <w:t xml:space="preserve">720</w:t>
+              <w:t xml:space="preserve">782</w:t>
             </w:r>
           </w:p>
         </w:tc>
@@ -671,7 +671,7 @@
                 <w:sz w:val="18"/>
                 <w:szCs w:val="18"/>
               </w:rPr>
-              <w:t xml:space="preserve">256</w:t>
+              <w:t xml:space="preserve">271</w:t>
             </w:r>
           </w:p>
         </w:tc>
@@ -698,7 +698,7 @@
                 <w:sz w:val="18"/>
                 <w:szCs w:val="18"/>
               </w:rPr>
-              <w:t xml:space="preserve">47</w:t>
+              <w:t xml:space="preserve">48</w:t>
             </w:r>
           </w:p>
         </w:tc>
@@ -808,7 +808,7 @@
                 <w:sz w:val="18"/>
                 <w:szCs w:val="18"/>
               </w:rPr>
-              <w:t xml:space="preserve">542</w:t>
+              <w:t xml:space="preserve">544</w:t>
             </w:r>
           </w:p>
         </w:tc>
@@ -835,7 +835,7 @@
                 <w:sz w:val="18"/>
                 <w:szCs w:val="18"/>
               </w:rPr>
-              <w:t xml:space="preserve">29</w:t>
+              <w:t xml:space="preserve">30</w:t>
             </w:r>
           </w:p>
         </w:tc>
@@ -2019,7 +2019,7 @@
           <w:sz w:val="18"/>
           <w:szCs w:val="18"/>
         </w:rPr>
-        <w:t xml:space="preserve">Core zone · main era 2014– · 50 albums in the atlas · fed by V1, V3, V9, V20, V10, V2</w:t>
+        <w:t xml:space="preserve">Core zone · main era 2014– · 68 albums in the atlas · fed by V1, V3, V9, V20, V10, V2</w:t>
       </w:r>
     </w:p>
     <w:p>
@@ -3174,7 +3174,7 @@
           <w:sz w:val="18"/>
           <w:szCs w:val="18"/>
         </w:rPr>
-        <w:t xml:space="preserve">Core zone · main era 2014– · 39 albums in the atlas · fed by V2, V25, V13, V1</w:t>
+        <w:t xml:space="preserve">Core zone · main era 2014– · 42 albums in the atlas · fed by V2, V25, V13, V1</w:t>
       </w:r>
     </w:p>
     <w:p>
@@ -4150,7 +4150,7 @@
           <w:sz w:val="18"/>
           <w:szCs w:val="18"/>
         </w:rPr>
-        <w:t xml:space="preserve">Core zone · main era 2014– · 35 albums in the atlas · fed by V9, V6, V26, V19, V7</w:t>
+        <w:t xml:space="preserve">Core zone · main era 2014– · 43 albums in the atlas · fed by V9, V6, V26, V19, V7</w:t>
       </w:r>
     </w:p>
     <w:p>
@@ -5229,7 +5229,7 @@
           <w:sz w:val="18"/>
           <w:szCs w:val="18"/>
         </w:rPr>
-        <w:t xml:space="preserve">Core zone · main era 2018– · 21 albums in the atlas · fed by V12, V16, X9, V20, V3</w:t>
+        <w:t xml:space="preserve">Core zone · main era 2018– · 29 albums in the atlas · fed by V12, V16, X9, V20, V3</w:t>
       </w:r>
     </w:p>
     <w:p>
@@ -6296,7 +6296,7 @@
           <w:sz w:val="18"/>
           <w:szCs w:val="18"/>
         </w:rPr>
-        <w:t xml:space="preserve">Core zone · main era 2014– · 176 albums in the atlas · fed by V5, V8, V24, V25, V30, V11</w:t>
+        <w:t xml:space="preserve">Core zone · main era 2014– · 186 albums in the atlas · fed by V5, V8, V24, V25, V30, V11</w:t>
       </w:r>
     </w:p>
     <w:p>
@@ -7961,7 +7961,7 @@
           <w:sz w:val="18"/>
           <w:szCs w:val="18"/>
         </w:rPr>
-        <w:t xml:space="preserve">Core zone · main era 2005– · 170 albums in the atlas · fed by V21, V27, V20, V28, V8, V4</w:t>
+        <w:t xml:space="preserve">Core zone · main era 2005– · 174 albums in the atlas · fed by V21, V27, V20, V28, V8, V4</w:t>
       </w:r>
     </w:p>
     <w:p>
@@ -9422,7 +9422,7 @@
           <w:sz w:val="18"/>
           <w:szCs w:val="18"/>
         </w:rPr>
-        <w:t xml:space="preserve">Core zone · main era 2008– · 190 albums in the atlas · fed by V10, V11, V17, V18, V16</w:t>
+        <w:t xml:space="preserve">Core zone · main era 2008– · 196 albums in the atlas · fed by V10, V11, V17, V18, V16</w:t>
       </w:r>
     </w:p>
     <w:p>
@@ -10667,7 +10667,7 @@
           <w:sz w:val="18"/>
           <w:szCs w:val="18"/>
         </w:rPr>
-        <w:t xml:space="preserve">Core zone · main era 2014– · 58 albums in the atlas · fed by V12, V5, V1, V2</w:t>
+        <w:t xml:space="preserve">Core zone · main era 2014– · 60 albums in the atlas · fed by V12, V5, V1, V2</w:t>
       </w:r>
     </w:p>
     <w:p>
@@ -11735,7 +11735,7 @@
           <w:sz w:val="18"/>
           <w:szCs w:val="18"/>
         </w:rPr>
-        <w:t xml:space="preserve">Core zone · main era 2012– · 30 albums in the atlas · fed by X6, V10, V9, V3</w:t>
+        <w:t xml:space="preserve">Core zone · main era 2012– · 33 albums in the atlas · fed by X6, V10, V9, V3</w:t>
       </w:r>
     </w:p>
     <w:p>
@@ -17480,7 +17480,7 @@
           <w:sz w:val="18"/>
           <w:szCs w:val="18"/>
         </w:rPr>
-        <w:t xml:space="preserve">V zone · main era 1998– · 143 albums in the atlas · fed by V9, V13, V26, V6</w:t>
+        <w:t xml:space="preserve">V zone · main era 1998– · 160 albums in the atlas · fed by V9, V13, V26, V6</w:t>
       </w:r>
     </w:p>
     <w:p>
@@ -17864,7 +17864,94 @@
         <w:rPr>
           <w:rFonts w:ascii="Arial" w:cs="Arial" w:eastAsia="Arial" w:hAnsi="Arial"/>
         </w:rPr>
-        <w:t xml:space="preserve"> answered the murder-ballad tradition with 'The Body Electric'.</w:t>
+        <w:t xml:space="preserve"> answered the murder-ballad tradition with 'The Body Electric'. New Orleans runs its own branch of the lane: alongside Hurray for the Riff Raff and The Deslondes, the band's singers made records under their own names, Sam Doores's </w:t>
+      </w:r>
+      <w:r>
+        <w:rPr>
+          <w:rFonts w:ascii="Arial" w:cs="Arial" w:eastAsia="Arial" w:hAnsi="Arial"/>
+          <w:i/>
+          <w:iCs/>
+        </w:rPr>
+        <w:t xml:space="preserve">Sam Doores</w:t>
+      </w:r>
+      <w:r>
+        <w:rPr>
+          <w:rFonts w:ascii="Arial" w:cs="Arial" w:eastAsia="Arial" w:hAnsi="Arial"/>
+        </w:rPr>
+        <w:t xml:space="preserve"> </w:t>
+      </w:r>
+      <w:r>
+        <w:rPr>
+          <w:rFonts w:ascii="Arial" w:cs="Arial" w:eastAsia="Arial" w:hAnsi="Arial"/>
+          <w:color w:val="7A4A1C"/>
+          <w:sz w:val="18"/>
+          <w:szCs w:val="18"/>
+        </w:rPr>
+        <w:t xml:space="preserve">A2866</w:t>
+      </w:r>
+      <w:r>
+        <w:rPr>
+          <w:rFonts w:ascii="Arial" w:cs="Arial" w:eastAsia="Arial" w:hAnsi="Arial"/>
+        </w:rPr>
+        <w:t xml:space="preserve"> and Riley Downing's </w:t>
+      </w:r>
+      <w:r>
+        <w:rPr>
+          <w:rFonts w:ascii="Arial" w:cs="Arial" w:eastAsia="Arial" w:hAnsi="Arial"/>
+          <w:i/>
+          <w:iCs/>
+        </w:rPr>
+        <w:t xml:space="preserve">Start It Over</w:t>
+      </w:r>
+      <w:r>
+        <w:rPr>
+          <w:rFonts w:ascii="Arial" w:cs="Arial" w:eastAsia="Arial" w:hAnsi="Arial"/>
+        </w:rPr>
+        <w:t xml:space="preserve"> </w:t>
+      </w:r>
+      <w:r>
+        <w:rPr>
+          <w:rFonts w:ascii="Arial" w:cs="Arial" w:eastAsia="Arial" w:hAnsi="Arial"/>
+          <w:color w:val="7A4A1C"/>
+          <w:sz w:val="18"/>
+          <w:szCs w:val="18"/>
+        </w:rPr>
+        <w:t xml:space="preserve">A2867</w:t>
+      </w:r>
+      <w:r>
+        <w:rPr>
+          <w:rFonts w:ascii="Arial" w:cs="Arial" w:eastAsia="Arial" w:hAnsi="Arial"/>
+        </w:rPr>
+        <w:t xml:space="preserve">, and The Lostines, who share players with that circle, arrived with </w:t>
+      </w:r>
+      <w:r>
+        <w:rPr>
+          <w:rFonts w:ascii="Arial" w:cs="Arial" w:eastAsia="Arial" w:hAnsi="Arial"/>
+          <w:i/>
+          <w:iCs/>
+        </w:rPr>
+        <w:t xml:space="preserve">Meet the Lostines</w:t>
+      </w:r>
+      <w:r>
+        <w:rPr>
+          <w:rFonts w:ascii="Arial" w:cs="Arial" w:eastAsia="Arial" w:hAnsi="Arial"/>
+        </w:rPr>
+        <w:t xml:space="preserve"> </w:t>
+      </w:r>
+      <w:r>
+        <w:rPr>
+          <w:rFonts w:ascii="Arial" w:cs="Arial" w:eastAsia="Arial" w:hAnsi="Arial"/>
+          <w:color w:val="7A4A1C"/>
+          <w:sz w:val="18"/>
+          <w:szCs w:val="18"/>
+        </w:rPr>
+        <w:t xml:space="preserve">A2872</w:t>
+      </w:r>
+      <w:r>
+        <w:rPr>
+          <w:rFonts w:ascii="Arial" w:cs="Arial" w:eastAsia="Arial" w:hAnsi="Arial"/>
+        </w:rPr>
+        <w:t xml:space="preserve">.</w:t>
       </w:r>
     </w:p>
     <w:p>
@@ -44057,7 +44144,7 @@
           <w:sz w:val="18"/>
           <w:szCs w:val="18"/>
         </w:rPr>
-        <w:t xml:space="preserve">Context zone · main era 1965– · 8 albums in the atlas · fed by R1</w:t>
+        <w:t xml:space="preserve">Context zone · main era 1965– · 10 albums in the atlas · fed by R1</w:t>
       </w:r>
     </w:p>
     <w:p>
@@ -50137,13 +50224,13 @@
           <w:sz w:val="18"/>
           <w:szCs w:val="18"/>
         </w:rPr>
-        <w:t xml:space="preserve"> · New Orleans, LA · 1995– · 15 albums tagged. </w:t>
-      </w:r>
-      <w:r>
-        <w:rPr>
-          <w:rFonts w:ascii="Arial" w:cs="Arial" w:eastAsia="Arial" w:hAnsi="Arial"/>
-        </w:rPr>
-        <w:t xml:space="preserve">Old-time, folk and honky-tonk revival around the French Quarter busking scene. Key artists: Hurray for the Riff Raff, The Deslondes, Esther Rose, Beulah. Labels: New West, ATO.</w:t>
+        <w:t xml:space="preserve"> · New Orleans, LA · 1995– · 34 albums tagged. </w:t>
+      </w:r>
+      <w:r>
+        <w:rPr>
+          <w:rFonts w:ascii="Arial" w:cs="Arial" w:eastAsia="Arial" w:hAnsi="Arial"/>
+        </w:rPr>
+        <w:t xml:space="preserve">Old-time, folk and honky-tonk revival that grew out of the street-busking circuit; the Deslondes' members and their friends turn up on each other's records. Key artists: Hurray for the Riff Raff, The Deslondes, Esther Rose, The Lostines, Sam Doores, Riley Downing, Luke Winslow-King, Sarah Quintana, Pat Reedy. Labels: New West, ATO.</w:t>
       </w:r>
     </w:p>
     <w:p>

</xml_diff>